<commit_message>
vault backup: 2026-04-07 16:14:51
</commit_message>
<xml_diff>
--- a/Раздел 2 ВКР Черновик.docx
+++ b/Раздел 2 ВКР Черновик.docx
@@ -178,23 +178,6 @@
       <w:pPr>
         <w:autoSpaceDE w:val="0"/>
         <w:spacing w:after="0" w:line="240" w:lineRule="auto"/>
-        <w:ind w:firstLine="709"/>
-        <w:jc w:val="center"/>
-        <w:rPr>
-          <w:rFonts w:ascii="Times New Roman" w:eastAsia="SimSun" w:hAnsi="Times New Roman" w:cs="Times New Roman"/>
-          <w:b/>
-          <w:color w:val="000000"/>
-          <w:sz w:val="24"/>
-          <w:szCs w:val="24"/>
-        </w:rPr>
-      </w:pPr>
-    </w:p>
-    <w:p>
-      <w:pPr>
-        <w:autoSpaceDE w:val="0"/>
-        <w:spacing w:after="0" w:line="240" w:lineRule="auto"/>
-        <w:ind w:firstLine="709"/>
-        <w:jc w:val="center"/>
         <w:rPr>
           <w:rFonts w:ascii="Times New Roman" w:eastAsia="SimSun" w:hAnsi="Times New Roman" w:cs="Times New Roman"/>
           <w:b/>
@@ -555,21 +538,6 @@
           <w:szCs w:val="26"/>
         </w:rPr>
       </w:pPr>
-    </w:p>
-    <w:p>
-      <w:pPr>
-        <w:tabs>
-          <w:tab w:val="left" w:pos="0"/>
-          <w:tab w:val="left" w:pos="1672"/>
-        </w:tabs>
-        <w:spacing w:after="120" w:line="240" w:lineRule="auto"/>
-        <w:rPr>
-          <w:rFonts w:ascii="Times New Roman" w:eastAsia="SimSun" w:hAnsi="Times New Roman" w:cs="Times New Roman"/>
-          <w:bCs/>
-          <w:sz w:val="26"/>
-          <w:szCs w:val="26"/>
-        </w:rPr>
-      </w:pPr>
       <w:r>
         <w:rPr>
           <w:rFonts w:ascii="Times New Roman" w:eastAsia="SimSun" w:hAnsi="Times New Roman" w:cs="Times New Roman"/>
@@ -912,6 +880,82 @@
     </w:p>
     <w:p>
       <w:pPr>
+        <w:spacing w:after="0" w:line="240" w:lineRule="auto"/>
+        <w:jc w:val="right"/>
+        <w:rPr>
+          <w:rFonts w:ascii="Times New Roman" w:eastAsia="SimSun" w:hAnsi="Times New Roman" w:cs="Times New Roman"/>
+          <w:bCs/>
+          <w:sz w:val="26"/>
+          <w:szCs w:val="26"/>
+        </w:rPr>
+      </w:pPr>
+      <w:r>
+        <w:rPr>
+          <w:rFonts w:ascii="Times New Roman" w:eastAsia="SimSun" w:hAnsi="Times New Roman" w:cs="Times New Roman"/>
+          <w:bCs/>
+          <w:sz w:val="26"/>
+          <w:szCs w:val="26"/>
+        </w:rPr>
+        <w:tab/>
+      </w:r>
+      <w:r>
+        <w:rPr>
+          <w:rFonts w:ascii="Times New Roman" w:eastAsia="SimSun" w:hAnsi="Times New Roman" w:cs="Times New Roman"/>
+          <w:bCs/>
+          <w:sz w:val="26"/>
+          <w:szCs w:val="26"/>
+        </w:rPr>
+        <w:tab/>
+      </w:r>
+      <w:r>
+        <w:rPr>
+          <w:rFonts w:ascii="Times New Roman" w:eastAsia="SimSun" w:hAnsi="Times New Roman" w:cs="Times New Roman"/>
+          <w:bCs/>
+          <w:sz w:val="26"/>
+          <w:szCs w:val="26"/>
+        </w:rPr>
+        <w:tab/>
+      </w:r>
+      <w:r>
+        <w:rPr>
+          <w:rFonts w:ascii="Times New Roman" w:eastAsia="SimSun" w:hAnsi="Times New Roman" w:cs="Times New Roman"/>
+          <w:bCs/>
+          <w:sz w:val="26"/>
+          <w:szCs w:val="26"/>
+        </w:rPr>
+        <w:tab/>
+      </w:r>
+      <w:r>
+        <w:rPr>
+          <w:rFonts w:ascii="Times New Roman" w:eastAsia="SimSun" w:hAnsi="Times New Roman" w:cs="Times New Roman"/>
+          <w:bCs/>
+          <w:sz w:val="26"/>
+          <w:szCs w:val="26"/>
+        </w:rPr>
+        <w:tab/>
+      </w:r>
+      <w:r>
+        <w:rPr>
+          <w:rFonts w:ascii="Times New Roman" w:eastAsia="SimSun" w:hAnsi="Times New Roman" w:cs="Times New Roman"/>
+          <w:bCs/>
+          <w:sz w:val="26"/>
+          <w:szCs w:val="26"/>
+        </w:rPr>
+        <w:tab/>
+      </w:r>
+      <w:r>
+        <w:rPr>
+          <w:rFonts w:ascii="Times New Roman" w:eastAsia="SimSun" w:hAnsi="Times New Roman" w:cs="Times New Roman"/>
+          <w:bCs/>
+          <w:sz w:val="26"/>
+          <w:szCs w:val="26"/>
+        </w:rPr>
+        <w:tab/>
+        <w:t>«____»_________________20____г.</w:t>
+      </w:r>
+    </w:p>
+    <w:p>
+      <w:pPr>
         <w:spacing w:after="120" w:line="240" w:lineRule="auto"/>
         <w:jc w:val="right"/>
         <w:rPr>
@@ -921,6 +965,27 @@
           <w:szCs w:val="26"/>
         </w:rPr>
       </w:pPr>
+    </w:p>
+    <w:p>
+      <w:pPr>
+        <w:spacing w:after="120" w:line="240" w:lineRule="auto"/>
+        <w:ind w:firstLine="708"/>
+        <w:rPr>
+          <w:rFonts w:ascii="Times New Roman" w:eastAsia="SimSun" w:hAnsi="Times New Roman" w:cs="Times New Roman"/>
+          <w:bCs/>
+          <w:sz w:val="26"/>
+          <w:szCs w:val="26"/>
+        </w:rPr>
+      </w:pPr>
+      <w:r>
+        <w:rPr>
+          <w:rFonts w:ascii="Times New Roman" w:eastAsia="SimSun" w:hAnsi="Times New Roman" w:cs="Times New Roman"/>
+          <w:bCs/>
+          <w:sz w:val="26"/>
+          <w:szCs w:val="26"/>
+        </w:rPr>
+        <w:t xml:space="preserve">                        </w:t>
+      </w:r>
       <w:r>
         <w:rPr>
           <w:rFonts w:ascii="Times New Roman" w:eastAsia="SimSun" w:hAnsi="Times New Roman" w:cs="Times New Roman"/>
@@ -956,7 +1021,20 @@
           <w:szCs w:val="26"/>
         </w:rPr>
         <w:tab/>
-      </w:r>
+        <w:t xml:space="preserve">      Дата защиты:</w:t>
+      </w:r>
+    </w:p>
+    <w:p>
+      <w:pPr>
+        <w:spacing w:after="0" w:line="240" w:lineRule="auto"/>
+        <w:jc w:val="right"/>
+        <w:rPr>
+          <w:rFonts w:ascii="Times New Roman" w:eastAsia="SimSun" w:hAnsi="Times New Roman" w:cs="Times New Roman"/>
+          <w:bCs/>
+          <w:sz w:val="26"/>
+          <w:szCs w:val="26"/>
+        </w:rPr>
+      </w:pPr>
       <w:r>
         <w:rPr>
           <w:rFonts w:ascii="Times New Roman" w:eastAsia="SimSun" w:hAnsi="Times New Roman" w:cs="Times New Roman"/>
@@ -983,7 +1061,118 @@
           <w:szCs w:val="26"/>
         </w:rPr>
         <w:tab/>
-        <w:t>«____»_________________20____г.</w:t>
+      </w:r>
+      <w:r>
+        <w:rPr>
+          <w:rFonts w:ascii="Times New Roman" w:eastAsia="SimSun" w:hAnsi="Times New Roman" w:cs="Times New Roman"/>
+          <w:bCs/>
+          <w:sz w:val="26"/>
+          <w:szCs w:val="26"/>
+        </w:rPr>
+        <w:tab/>
+      </w:r>
+      <w:r>
+        <w:rPr>
+          <w:rFonts w:ascii="Times New Roman" w:eastAsia="SimSun" w:hAnsi="Times New Roman" w:cs="Times New Roman"/>
+          <w:bCs/>
+          <w:sz w:val="26"/>
+          <w:szCs w:val="26"/>
+        </w:rPr>
+        <w:tab/>
+      </w:r>
+      <w:r>
+        <w:rPr>
+          <w:rFonts w:ascii="Times New Roman" w:eastAsia="SimSun" w:hAnsi="Times New Roman" w:cs="Times New Roman"/>
+          <w:bCs/>
+          <w:sz w:val="26"/>
+          <w:szCs w:val="26"/>
+        </w:rPr>
+        <w:tab/>
+      </w:r>
+      <w:r>
+        <w:rPr>
+          <w:rFonts w:ascii="Times New Roman" w:eastAsia="SimSun" w:hAnsi="Times New Roman" w:cs="Times New Roman"/>
+          <w:bCs/>
+          <w:sz w:val="26"/>
+          <w:szCs w:val="26"/>
+        </w:rPr>
+        <w:tab/>
+        <w:t xml:space="preserve"> «____»________________20____г.</w:t>
+      </w:r>
+    </w:p>
+    <w:p>
+      <w:pPr>
+        <w:spacing w:after="120" w:line="240" w:lineRule="auto"/>
+        <w:rPr>
+          <w:rFonts w:ascii="Times New Roman" w:eastAsia="SimSun" w:hAnsi="Times New Roman" w:cs="Times New Roman"/>
+          <w:bCs/>
+          <w:sz w:val="26"/>
+          <w:szCs w:val="26"/>
+        </w:rPr>
+      </w:pPr>
+      <w:r>
+        <w:rPr>
+          <w:rFonts w:ascii="Times New Roman" w:eastAsia="SimSun" w:hAnsi="Times New Roman" w:cs="Times New Roman"/>
+          <w:bCs/>
+          <w:sz w:val="26"/>
+          <w:szCs w:val="26"/>
+        </w:rPr>
+        <w:tab/>
+      </w:r>
+      <w:r>
+        <w:rPr>
+          <w:rFonts w:ascii="Times New Roman" w:eastAsia="SimSun" w:hAnsi="Times New Roman" w:cs="Times New Roman"/>
+          <w:bCs/>
+          <w:sz w:val="26"/>
+          <w:szCs w:val="26"/>
+        </w:rPr>
+        <w:tab/>
+      </w:r>
+      <w:r>
+        <w:rPr>
+          <w:rFonts w:ascii="Times New Roman" w:eastAsia="SimSun" w:hAnsi="Times New Roman" w:cs="Times New Roman"/>
+          <w:bCs/>
+          <w:sz w:val="26"/>
+          <w:szCs w:val="26"/>
+        </w:rPr>
+        <w:tab/>
+      </w:r>
+      <w:r>
+        <w:rPr>
+          <w:rFonts w:ascii="Times New Roman" w:eastAsia="SimSun" w:hAnsi="Times New Roman" w:cs="Times New Roman"/>
+          <w:bCs/>
+          <w:sz w:val="26"/>
+          <w:szCs w:val="26"/>
+        </w:rPr>
+        <w:tab/>
+      </w:r>
+      <w:r>
+        <w:rPr>
+          <w:rFonts w:ascii="Times New Roman" w:eastAsia="SimSun" w:hAnsi="Times New Roman" w:cs="Times New Roman"/>
+          <w:bCs/>
+          <w:sz w:val="26"/>
+          <w:szCs w:val="26"/>
+        </w:rPr>
+        <w:tab/>
+      </w:r>
+      <w:r>
+        <w:rPr>
+          <w:rFonts w:ascii="Times New Roman" w:eastAsia="SimSun" w:hAnsi="Times New Roman" w:cs="Times New Roman"/>
+          <w:bCs/>
+          <w:sz w:val="26"/>
+          <w:szCs w:val="26"/>
+        </w:rPr>
+        <w:tab/>
+      </w:r>
+      <w:r>
+        <w:rPr>
+          <w:rFonts w:ascii="Times New Roman" w:eastAsia="SimSun" w:hAnsi="Times New Roman" w:cs="Times New Roman"/>
+          <w:bCs/>
+          <w:sz w:val="26"/>
+          <w:szCs w:val="26"/>
+        </w:rPr>
+        <w:tab/>
+        <w:t xml:space="preserve">           </w:t>
       </w:r>
     </w:p>
     <w:p>
@@ -997,227 +1186,6 @@
           <w:szCs w:val="26"/>
         </w:rPr>
       </w:pPr>
-    </w:p>
-    <w:p>
-      <w:pPr>
-        <w:spacing w:after="120" w:line="240" w:lineRule="auto"/>
-        <w:ind w:firstLine="708"/>
-        <w:rPr>
-          <w:rFonts w:ascii="Times New Roman" w:eastAsia="SimSun" w:hAnsi="Times New Roman" w:cs="Times New Roman"/>
-          <w:bCs/>
-          <w:sz w:val="26"/>
-          <w:szCs w:val="26"/>
-        </w:rPr>
-      </w:pPr>
-      <w:r>
-        <w:rPr>
-          <w:rFonts w:ascii="Times New Roman" w:eastAsia="SimSun" w:hAnsi="Times New Roman" w:cs="Times New Roman"/>
-          <w:bCs/>
-          <w:sz w:val="26"/>
-          <w:szCs w:val="26"/>
-        </w:rPr>
-        <w:t xml:space="preserve">                        </w:t>
-      </w:r>
-      <w:r>
-        <w:rPr>
-          <w:rFonts w:ascii="Times New Roman" w:eastAsia="SimSun" w:hAnsi="Times New Roman" w:cs="Times New Roman"/>
-          <w:bCs/>
-          <w:sz w:val="26"/>
-          <w:szCs w:val="26"/>
-        </w:rPr>
-        <w:tab/>
-      </w:r>
-      <w:r>
-        <w:rPr>
-          <w:rFonts w:ascii="Times New Roman" w:eastAsia="SimSun" w:hAnsi="Times New Roman" w:cs="Times New Roman"/>
-          <w:bCs/>
-          <w:sz w:val="26"/>
-          <w:szCs w:val="26"/>
-        </w:rPr>
-        <w:tab/>
-      </w:r>
-      <w:r>
-        <w:rPr>
-          <w:rFonts w:ascii="Times New Roman" w:eastAsia="SimSun" w:hAnsi="Times New Roman" w:cs="Times New Roman"/>
-          <w:bCs/>
-          <w:sz w:val="26"/>
-          <w:szCs w:val="26"/>
-        </w:rPr>
-        <w:tab/>
-      </w:r>
-      <w:r>
-        <w:rPr>
-          <w:rFonts w:ascii="Times New Roman" w:eastAsia="SimSun" w:hAnsi="Times New Roman" w:cs="Times New Roman"/>
-          <w:bCs/>
-          <w:sz w:val="26"/>
-          <w:szCs w:val="26"/>
-        </w:rPr>
-        <w:tab/>
-        <w:t xml:space="preserve">      Дата защиты:</w:t>
-      </w:r>
-    </w:p>
-    <w:p>
-      <w:pPr>
-        <w:spacing w:after="120" w:line="240" w:lineRule="auto"/>
-        <w:jc w:val="right"/>
-        <w:rPr>
-          <w:rFonts w:ascii="Times New Roman" w:eastAsia="SimSun" w:hAnsi="Times New Roman" w:cs="Times New Roman"/>
-          <w:bCs/>
-          <w:sz w:val="26"/>
-          <w:szCs w:val="26"/>
-        </w:rPr>
-      </w:pPr>
-      <w:r>
-        <w:rPr>
-          <w:rFonts w:ascii="Times New Roman" w:eastAsia="SimSun" w:hAnsi="Times New Roman" w:cs="Times New Roman"/>
-          <w:bCs/>
-          <w:sz w:val="26"/>
-          <w:szCs w:val="26"/>
-        </w:rPr>
-        <w:tab/>
-      </w:r>
-      <w:r>
-        <w:rPr>
-          <w:rFonts w:ascii="Times New Roman" w:eastAsia="SimSun" w:hAnsi="Times New Roman" w:cs="Times New Roman"/>
-          <w:bCs/>
-          <w:sz w:val="26"/>
-          <w:szCs w:val="26"/>
-        </w:rPr>
-        <w:tab/>
-      </w:r>
-      <w:r>
-        <w:rPr>
-          <w:rFonts w:ascii="Times New Roman" w:eastAsia="SimSun" w:hAnsi="Times New Roman" w:cs="Times New Roman"/>
-          <w:bCs/>
-          <w:sz w:val="26"/>
-          <w:szCs w:val="26"/>
-        </w:rPr>
-        <w:tab/>
-      </w:r>
-      <w:r>
-        <w:rPr>
-          <w:rFonts w:ascii="Times New Roman" w:eastAsia="SimSun" w:hAnsi="Times New Roman" w:cs="Times New Roman"/>
-          <w:bCs/>
-          <w:sz w:val="26"/>
-          <w:szCs w:val="26"/>
-        </w:rPr>
-        <w:tab/>
-      </w:r>
-      <w:r>
-        <w:rPr>
-          <w:rFonts w:ascii="Times New Roman" w:eastAsia="SimSun" w:hAnsi="Times New Roman" w:cs="Times New Roman"/>
-          <w:bCs/>
-          <w:sz w:val="26"/>
-          <w:szCs w:val="26"/>
-        </w:rPr>
-        <w:tab/>
-      </w:r>
-      <w:r>
-        <w:rPr>
-          <w:rFonts w:ascii="Times New Roman" w:eastAsia="SimSun" w:hAnsi="Times New Roman" w:cs="Times New Roman"/>
-          <w:bCs/>
-          <w:sz w:val="26"/>
-          <w:szCs w:val="26"/>
-        </w:rPr>
-        <w:tab/>
-      </w:r>
-      <w:r>
-        <w:rPr>
-          <w:rFonts w:ascii="Times New Roman" w:eastAsia="SimSun" w:hAnsi="Times New Roman" w:cs="Times New Roman"/>
-          <w:bCs/>
-          <w:sz w:val="26"/>
-          <w:szCs w:val="26"/>
-        </w:rPr>
-        <w:tab/>
-        <w:t xml:space="preserve"> «____»________________20____г.</w:t>
-      </w:r>
-    </w:p>
-    <w:p>
-      <w:pPr>
-        <w:spacing w:after="120" w:line="240" w:lineRule="auto"/>
-        <w:rPr>
-          <w:rFonts w:ascii="Times New Roman" w:eastAsia="SimSun" w:hAnsi="Times New Roman" w:cs="Times New Roman"/>
-          <w:bCs/>
-          <w:sz w:val="26"/>
-          <w:szCs w:val="26"/>
-        </w:rPr>
-      </w:pPr>
-      <w:r>
-        <w:rPr>
-          <w:rFonts w:ascii="Times New Roman" w:eastAsia="SimSun" w:hAnsi="Times New Roman" w:cs="Times New Roman"/>
-          <w:bCs/>
-          <w:sz w:val="26"/>
-          <w:szCs w:val="26"/>
-        </w:rPr>
-        <w:tab/>
-      </w:r>
-      <w:r>
-        <w:rPr>
-          <w:rFonts w:ascii="Times New Roman" w:eastAsia="SimSun" w:hAnsi="Times New Roman" w:cs="Times New Roman"/>
-          <w:bCs/>
-          <w:sz w:val="26"/>
-          <w:szCs w:val="26"/>
-        </w:rPr>
-        <w:tab/>
-      </w:r>
-      <w:r>
-        <w:rPr>
-          <w:rFonts w:ascii="Times New Roman" w:eastAsia="SimSun" w:hAnsi="Times New Roman" w:cs="Times New Roman"/>
-          <w:bCs/>
-          <w:sz w:val="26"/>
-          <w:szCs w:val="26"/>
-        </w:rPr>
-        <w:tab/>
-      </w:r>
-      <w:r>
-        <w:rPr>
-          <w:rFonts w:ascii="Times New Roman" w:eastAsia="SimSun" w:hAnsi="Times New Roman" w:cs="Times New Roman"/>
-          <w:bCs/>
-          <w:sz w:val="26"/>
-          <w:szCs w:val="26"/>
-        </w:rPr>
-        <w:tab/>
-      </w:r>
-      <w:r>
-        <w:rPr>
-          <w:rFonts w:ascii="Times New Roman" w:eastAsia="SimSun" w:hAnsi="Times New Roman" w:cs="Times New Roman"/>
-          <w:bCs/>
-          <w:sz w:val="26"/>
-          <w:szCs w:val="26"/>
-        </w:rPr>
-        <w:tab/>
-      </w:r>
-      <w:r>
-        <w:rPr>
-          <w:rFonts w:ascii="Times New Roman" w:eastAsia="SimSun" w:hAnsi="Times New Roman" w:cs="Times New Roman"/>
-          <w:bCs/>
-          <w:sz w:val="26"/>
-          <w:szCs w:val="26"/>
-        </w:rPr>
-        <w:tab/>
-      </w:r>
-      <w:r>
-        <w:rPr>
-          <w:rFonts w:ascii="Times New Roman" w:eastAsia="SimSun" w:hAnsi="Times New Roman" w:cs="Times New Roman"/>
-          <w:bCs/>
-          <w:sz w:val="26"/>
-          <w:szCs w:val="26"/>
-        </w:rPr>
-        <w:tab/>
-        <w:t xml:space="preserve">           </w:t>
-      </w:r>
-    </w:p>
-    <w:p>
-      <w:pPr>
-        <w:spacing w:after="120" w:line="240" w:lineRule="auto"/>
-        <w:jc w:val="right"/>
-        <w:rPr>
-          <w:rFonts w:ascii="Times New Roman" w:eastAsia="SimSun" w:hAnsi="Times New Roman" w:cs="Times New Roman"/>
-          <w:bCs/>
-          <w:sz w:val="26"/>
-          <w:szCs w:val="26"/>
-        </w:rPr>
-      </w:pPr>
       <w:r>
         <w:rPr>
           <w:rFonts w:ascii="Times New Roman" w:eastAsia="SimSun" w:hAnsi="Times New Roman" w:cs="Times New Roman"/>
@@ -1227,19 +1195,6 @@
         </w:rPr>
         <w:t>Оценка: ______________________</w:t>
       </w:r>
-    </w:p>
-    <w:p>
-      <w:pPr>
-        <w:autoSpaceDE w:val="0"/>
-        <w:spacing w:after="0" w:line="240" w:lineRule="auto"/>
-        <w:ind w:firstLine="709"/>
-        <w:rPr>
-          <w:rFonts w:ascii="Times New Roman" w:eastAsia="SimSun" w:hAnsi="Times New Roman" w:cs="Times New Roman"/>
-          <w:color w:val="000000"/>
-          <w:sz w:val="26"/>
-          <w:szCs w:val="26"/>
-        </w:rPr>
-      </w:pPr>
     </w:p>
     <w:p>
       <w:pPr>
@@ -1999,41 +1954,14 @@
         <w:t>«_____»________________20____г.</w:t>
       </w:r>
     </w:p>
-    <w:p>
-      <w:pPr>
-        <w:suppressAutoHyphens w:val="0"/>
-        <w:spacing w:after="160" w:line="259" w:lineRule="auto"/>
-        <w:rPr>
-          <w:rFonts w:ascii="Times New Roman" w:hAnsi="Times New Roman" w:cs="Times New Roman"/>
-          <w:b/>
-          <w:sz w:val="28"/>
-          <w:szCs w:val="28"/>
-        </w:rPr>
-      </w:pPr>
-      <w:r>
-        <w:rPr>
-          <w:rFonts w:ascii="Times New Roman" w:hAnsi="Times New Roman" w:cs="Times New Roman"/>
-          <w:b/>
-          <w:sz w:val="28"/>
-          <w:szCs w:val="28"/>
-        </w:rPr>
-        <w:br w:type="page"/>
-      </w:r>
-    </w:p>
-    <w:p>
-      <w:pPr>
-        <w:rPr>
-          <w:rFonts w:ascii="Times New Roman" w:hAnsi="Times New Roman" w:cs="Times New Roman"/>
-          <w:b/>
-          <w:sz w:val="28"/>
-          <w:szCs w:val="28"/>
-        </w:rPr>
-      </w:pPr>
-    </w:p>
     <w:sdt>
       <w:sdtPr>
         <w:rPr>
-          <w:rFonts w:ascii="Times New Roman" w:hAnsi="Times New Roman" w:cs="Times New Roman"/>
+          <w:rFonts w:ascii="Times New Roman" w:eastAsia="Calibri" w:hAnsi="Times New Roman" w:cs="Times New Roman"/>
+          <w:color w:val="auto"/>
+          <w:sz w:val="22"/>
+          <w:szCs w:val="22"/>
+          <w:lang w:eastAsia="ar-SA"/>
         </w:rPr>
         <w:id w:val="-1534731143"/>
         <w:docPartObj>
@@ -2043,13 +1971,8 @@
       </w:sdtPr>
       <w:sdtEndPr>
         <w:rPr>
-          <w:rFonts w:eastAsia="Calibri"/>
-          <w:b/>
-          <w:bCs/>
-          <w:color w:val="auto"/>
-          <w:sz w:val="22"/>
-          <w:szCs w:val="22"/>
-          <w:lang w:eastAsia="ar-SA"/>
+          <w:b/>
+          <w:bCs/>
         </w:rPr>
       </w:sdtEndPr>
       <w:sdtContent>
@@ -3433,34 +3356,7 @@
           <w:sz w:val="28"/>
           <w:szCs w:val="28"/>
         </w:rPr>
-        <w:t xml:space="preserve">Целью данной курсовой работы является разработка </w:t>
-      </w:r>
-      <w:r>
-        <w:rPr>
-          <w:rFonts w:ascii="Times New Roman" w:hAnsi="Times New Roman" w:cs="Times New Roman"/>
-          <w:bCs/>
-          <w:sz w:val="28"/>
-          <w:szCs w:val="28"/>
-        </w:rPr>
-        <w:t>веб-приложения для формирования плана питания с использованием фреймворка Vue.js на языке TypeScript</w:t>
-      </w:r>
-      <w:r>
-        <w:rPr>
-          <w:rFonts w:ascii="Times New Roman" w:hAnsi="Times New Roman" w:cs="Times New Roman"/>
-          <w:bCs/>
-          <w:sz w:val="28"/>
-          <w:szCs w:val="28"/>
-        </w:rPr>
-        <w:t xml:space="preserve">. Для достижения </w:t>
-      </w:r>
-      <w:r>
-        <w:rPr>
-          <w:rFonts w:ascii="Times New Roman" w:hAnsi="Times New Roman" w:cs="Times New Roman"/>
-          <w:bCs/>
-          <w:sz w:val="28"/>
-          <w:szCs w:val="28"/>
-        </w:rPr>
-        <w:t xml:space="preserve">поставленной цели необходимо решить следующие задачи: </w:t>
+        <w:t xml:space="preserve">Целью данной курсовой работы является разработка веб-приложения для формирования плана питания с использованием фреймворка Vue.js на языке TypeScript. Для достижения поставленной цели необходимо решить следующие задачи: </w:t>
       </w:r>
     </w:p>
     <w:p>
@@ -3782,7 +3678,7 @@
           </w:tcPr>
           <w:p>
             <w:pPr>
-              <w:spacing w:after="0" w:line="360" w:lineRule="auto"/>
+              <w:spacing w:after="0" w:line="240" w:lineRule="auto"/>
               <w:jc w:val="both"/>
               <w:rPr>
                 <w:rFonts w:ascii="Times New Roman" w:eastAsia="Times New Roman" w:hAnsi="Times New Roman" w:cs="Times New Roman"/>
@@ -3822,7 +3718,7 @@
           </w:tcPr>
           <w:p>
             <w:pPr>
-              <w:spacing w:after="0" w:line="360" w:lineRule="auto"/>
+              <w:spacing w:after="0" w:line="240" w:lineRule="auto"/>
               <w:jc w:val="both"/>
               <w:rPr>
                 <w:rFonts w:ascii="Times New Roman" w:eastAsia="Times New Roman" w:hAnsi="Times New Roman" w:cs="Times New Roman"/>
@@ -3862,7 +3758,7 @@
           </w:tcPr>
           <w:p>
             <w:pPr>
-              <w:spacing w:after="0" w:line="360" w:lineRule="auto"/>
+              <w:spacing w:after="0" w:line="240" w:lineRule="auto"/>
               <w:jc w:val="both"/>
               <w:rPr>
                 <w:rFonts w:ascii="Times New Roman" w:eastAsia="Times New Roman" w:hAnsi="Times New Roman" w:cs="Times New Roman"/>
@@ -3907,7 +3803,7 @@
           </w:tcPr>
           <w:p>
             <w:pPr>
-              <w:spacing w:after="0" w:line="360" w:lineRule="auto"/>
+              <w:spacing w:after="0" w:line="240" w:lineRule="auto"/>
               <w:jc w:val="both"/>
               <w:rPr>
                 <w:rFonts w:ascii="Times New Roman" w:eastAsia="Times New Roman" w:hAnsi="Times New Roman" w:cs="Times New Roman"/>
@@ -3945,7 +3841,7 @@
           </w:tcPr>
           <w:p>
             <w:pPr>
-              <w:spacing w:after="0" w:line="360" w:lineRule="auto"/>
+              <w:spacing w:after="0" w:line="240" w:lineRule="auto"/>
               <w:jc w:val="both"/>
               <w:rPr>
                 <w:rFonts w:ascii="Times New Roman" w:eastAsia="Times New Roman" w:hAnsi="Times New Roman" w:cs="Times New Roman"/>
@@ -3983,7 +3879,7 @@
           </w:tcPr>
           <w:p>
             <w:pPr>
-              <w:spacing w:after="0" w:line="360" w:lineRule="auto"/>
+              <w:spacing w:after="0" w:line="240" w:lineRule="auto"/>
               <w:jc w:val="both"/>
               <w:rPr>
                 <w:rFonts w:ascii="Times New Roman" w:eastAsia="Times New Roman" w:hAnsi="Times New Roman" w:cs="Times New Roman"/>
@@ -4044,7 +3940,7 @@
           </w:tcPr>
           <w:p>
             <w:pPr>
-              <w:spacing w:after="0" w:line="360" w:lineRule="auto"/>
+              <w:spacing w:after="0" w:line="240" w:lineRule="auto"/>
               <w:jc w:val="both"/>
               <w:rPr>
                 <w:rFonts w:ascii="Times New Roman" w:eastAsia="Times New Roman" w:hAnsi="Times New Roman" w:cs="Times New Roman"/>
@@ -4082,7 +3978,7 @@
           </w:tcPr>
           <w:p>
             <w:pPr>
-              <w:spacing w:after="0" w:line="360" w:lineRule="auto"/>
+              <w:spacing w:after="0" w:line="240" w:lineRule="auto"/>
               <w:jc w:val="both"/>
               <w:rPr>
                 <w:rFonts w:ascii="Times New Roman" w:eastAsia="Times New Roman" w:hAnsi="Times New Roman" w:cs="Times New Roman"/>
@@ -4120,7 +4016,7 @@
           </w:tcPr>
           <w:p>
             <w:pPr>
-              <w:spacing w:after="0" w:line="360" w:lineRule="auto"/>
+              <w:spacing w:after="0" w:line="240" w:lineRule="auto"/>
               <w:jc w:val="both"/>
               <w:rPr>
                 <w:rFonts w:ascii="Times New Roman" w:eastAsia="Times New Roman" w:hAnsi="Times New Roman" w:cs="Times New Roman"/>
@@ -4181,7 +4077,7 @@
           </w:tcPr>
           <w:p>
             <w:pPr>
-              <w:spacing w:after="0" w:line="360" w:lineRule="auto"/>
+              <w:spacing w:after="0" w:line="240" w:lineRule="auto"/>
               <w:jc w:val="both"/>
               <w:rPr>
                 <w:rFonts w:ascii="Times New Roman" w:eastAsia="Times New Roman" w:hAnsi="Times New Roman" w:cs="Times New Roman"/>
@@ -4219,7 +4115,7 @@
           </w:tcPr>
           <w:p>
             <w:pPr>
-              <w:spacing w:after="0" w:line="360" w:lineRule="auto"/>
+              <w:spacing w:after="0" w:line="240" w:lineRule="auto"/>
               <w:jc w:val="both"/>
               <w:rPr>
                 <w:rFonts w:ascii="Times New Roman" w:eastAsia="Times New Roman" w:hAnsi="Times New Roman" w:cs="Times New Roman"/>
@@ -4257,7 +4153,7 @@
           </w:tcPr>
           <w:p>
             <w:pPr>
-              <w:spacing w:after="0" w:line="360" w:lineRule="auto"/>
+              <w:spacing w:after="0" w:line="240" w:lineRule="auto"/>
               <w:jc w:val="both"/>
               <w:rPr>
                 <w:rFonts w:ascii="Times New Roman" w:eastAsia="Times New Roman" w:hAnsi="Times New Roman" w:cs="Times New Roman"/>
@@ -4299,7 +4195,6 @@
     </w:tbl>
     <w:p>
       <w:pPr>
-        <w:ind w:left="567"/>
         <w:jc w:val="both"/>
         <w:rPr>
           <w:rFonts w:ascii="Times New Roman" w:hAnsi="Times New Roman" w:cs="Times New Roman"/>
@@ -4395,7 +4290,15 @@
           <w:sz w:val="28"/>
           <w:szCs w:val="28"/>
         </w:rPr>
-        <w:t xml:space="preserve">функции доступные пользователям, гостям и </w:t>
+        <w:t>функции доступные пользователям, гостям и</w:t>
+      </w:r>
+      <w:r>
+        <w:rPr>
+          <w:rFonts w:ascii="Times New Roman" w:hAnsi="Times New Roman" w:cs="Times New Roman"/>
+          <w:sz w:val="28"/>
+          <w:szCs w:val="28"/>
+        </w:rPr>
+        <w:t xml:space="preserve"> </w:t>
       </w:r>
       <w:r>
         <w:rPr>
@@ -4801,7 +4704,16 @@
           <w:sz w:val="28"/>
           <w:szCs w:val="28"/>
         </w:rPr>
-        <w:t>следующие функции: просмотр списка рецептов, поиск рецептов с фильтрацией по категориям, открытие карточки рецепта с возможностью просмотра пошагового приготовления, замена продуктов на аналоги, просмотр КБЖУ, регистрация в системе и авторизация (вход как пользователь или администратор).</w:t>
+        <w:t xml:space="preserve">следующие функции: просмотр списка рецептов, поиск рецептов с фильтрацией по категориям, открытие карточки рецепта с </w:t>
+      </w:r>
+      <w:r>
+        <w:rPr>
+          <w:rFonts w:ascii="Times New Roman" w:hAnsi="Times New Roman" w:cs="Times New Roman"/>
+          <w:sz w:val="28"/>
+          <w:szCs w:val="28"/>
+        </w:rPr>
+        <w:lastRenderedPageBreak/>
+        <w:t>возможностью просмотра пошагового приготовления, замена продуктов на аналоги, просмотр КБЖУ, регистрация в системе и авторизация (вход как пользователь или администратор).</w:t>
       </w:r>
     </w:p>
     <w:p>
@@ -4822,7 +4734,6 @@
           <w:sz w:val="28"/>
           <w:szCs w:val="28"/>
         </w:rPr>
-        <w:lastRenderedPageBreak/>
         <w:t>Пользователю</w:t>
       </w:r>
       <w:r>
@@ -5068,15 +4979,7 @@
           <w:sz w:val="28"/>
           <w:szCs w:val="28"/>
         </w:rPr>
-        <w:t xml:space="preserve"> доступны все операции пользователя, а </w:t>
-      </w:r>
-      <w:r>
-        <w:rPr>
-          <w:rFonts w:ascii="Times New Roman" w:hAnsi="Times New Roman" w:cs="Times New Roman"/>
-          <w:sz w:val="28"/>
-          <w:szCs w:val="28"/>
-        </w:rPr>
-        <w:t xml:space="preserve">также </w:t>
+        <w:t xml:space="preserve"> доступны все операции пользователя, а также </w:t>
       </w:r>
       <w:r>
         <w:rPr>
@@ -5212,6 +5115,7 @@
           <w:sz w:val="28"/>
           <w:szCs w:val="28"/>
         </w:rPr>
+        <w:lastRenderedPageBreak/>
         <w:t>Управление аккаунтами</w:t>
       </w:r>
       <w:r>
@@ -5286,7 +5190,6 @@
         <w:rPr>
           <w:rFonts w:cs="Times New Roman"/>
         </w:rPr>
-        <w:lastRenderedPageBreak/>
         <w:t>2.2. Информационное обеспечение</w:t>
       </w:r>
       <w:bookmarkEnd w:id="5"/>
@@ -5465,7 +5368,16 @@
           <w:sz w:val="28"/>
           <w:szCs w:val="28"/>
         </w:rPr>
-        <w:t xml:space="preserve"> сущность, описывающая рецепт пользователя: название, описание, время приготовления, количество порций, категория, фото, калорийность, белки, жиры, углеводы, статус публикации, комментарий модерации, дата создания, а также ссылка на создателя и возможность копирования</w:t>
+        <w:t xml:space="preserve"> сущность, описывающая рецепт пользователя: название, описание, время приготовления, количество порций, категория, фото, калорийность, белки, жиры, углеводы, статус публикации, комментарий модерации, дата </w:t>
+      </w:r>
+      <w:r>
+        <w:rPr>
+          <w:rFonts w:ascii="Times New Roman" w:hAnsi="Times New Roman" w:cs="Times New Roman"/>
+          <w:sz w:val="28"/>
+          <w:szCs w:val="28"/>
+        </w:rPr>
+        <w:lastRenderedPageBreak/>
+        <w:t>создания, а также ссылка на создателя и возможность копирования</w:t>
       </w:r>
       <w:r>
         <w:rPr>
@@ -5709,16 +5621,7 @@
           <w:sz w:val="28"/>
           <w:szCs w:val="28"/>
         </w:rPr>
-        <w:t xml:space="preserve"> связью «многие ингредиенты в </w:t>
-      </w:r>
-      <w:r>
-        <w:rPr>
-          <w:rFonts w:ascii="Times New Roman" w:hAnsi="Times New Roman" w:cs="Times New Roman"/>
-          <w:sz w:val="28"/>
-          <w:szCs w:val="28"/>
-        </w:rPr>
-        <w:lastRenderedPageBreak/>
-        <w:t>одном рецепте (N:1)» и с </w:t>
+        <w:t> связью «многие ингредиенты в одном рецепте (N:1)» и с </w:t>
       </w:r>
       <w:r>
         <w:rPr>
@@ -6069,6 +5972,14 @@
           <w:szCs w:val="28"/>
         </w:rPr>
         <w:br/>
+      </w:r>
+      <w:r>
+        <w:rPr>
+          <w:rFonts w:ascii="Times New Roman" w:hAnsi="Times New Roman" w:cs="Times New Roman"/>
+          <w:sz w:val="28"/>
+          <w:szCs w:val="28"/>
+        </w:rPr>
+        <w:lastRenderedPageBreak/>
         <w:t>Сущность </w:t>
       </w:r>
       <w:r>
@@ -6402,14 +6313,6 @@
           <w:szCs w:val="28"/>
         </w:rPr>
         <w:br/>
-      </w:r>
-      <w:r>
-        <w:rPr>
-          <w:rFonts w:ascii="Times New Roman" w:hAnsi="Times New Roman" w:cs="Times New Roman"/>
-          <w:sz w:val="28"/>
-          <w:szCs w:val="28"/>
-        </w:rPr>
-        <w:lastRenderedPageBreak/>
         <w:t>Сущность </w:t>
       </w:r>
       <w:r>
@@ -6723,6 +6626,7 @@
           <w:sz w:val="28"/>
           <w:szCs w:val="28"/>
         </w:rPr>
+        <w:lastRenderedPageBreak/>
         <w:t>shopping_list</w:t>
       </w:r>
       <w:r>
@@ -7136,16 +7040,7 @@
           <w:sz w:val="28"/>
           <w:szCs w:val="28"/>
         </w:rPr>
-        <w:t xml:space="preserve"> – сущность, описывающая отзыв о рецепте: количество звёзд, текст отзыва, признак редактирования, дата создания, а также ссылки на </w:t>
-      </w:r>
-      <w:r>
-        <w:rPr>
-          <w:rFonts w:ascii="Times New Roman" w:hAnsi="Times New Roman" w:cs="Times New Roman"/>
-          <w:sz w:val="28"/>
-          <w:szCs w:val="28"/>
-        </w:rPr>
-        <w:lastRenderedPageBreak/>
-        <w:t>рецепт и пользователя.</w:t>
+        <w:t> – сущность, описывающая отзыв о рецепте: количество звёзд, текст отзыва, признак редактирования, дата создания, а также ссылки на рецепт и пользователя.</w:t>
       </w:r>
       <w:r>
         <w:rPr>
@@ -7359,6 +7254,7 @@
           <w:sz w:val="28"/>
           <w:szCs w:val="28"/>
         </w:rPr>
+        <w:lastRenderedPageBreak/>
         <w:t>daily_nutrition</w:t>
       </w:r>
       <w:r>
@@ -7871,7 +7767,6 @@
         <w:rPr>
           <w:rFonts w:cs="Times New Roman"/>
         </w:rPr>
-        <w:lastRenderedPageBreak/>
         <w:t>2.4. Программное обеспечение</w:t>
       </w:r>
       <w:bookmarkEnd w:id="8"/>
@@ -8018,6 +7913,7 @@
           <w:sz w:val="28"/>
           <w:szCs w:val="28"/>
         </w:rPr>
+        <w:lastRenderedPageBreak/>
         <w:t>- распределение прав ответственности (доступа) персонала;</w:t>
       </w:r>
     </w:p>
@@ -9335,6 +9231,7 @@
   <w:style w:type="character" w:default="1" w:styleId="a0">
     <w:name w:val="Default Paragraph Font"/>
     <w:uiPriority w:val="1"/>
+    <w:semiHidden/>
     <w:unhideWhenUsed/>
   </w:style>
   <w:style w:type="table" w:default="1" w:styleId="a1">

</xml_diff>

<commit_message>
vault backup: 2026-04-07 17:22:46
</commit_message>
<xml_diff>
--- a/Раздел 2 ВКР Черновик.docx
+++ b/Раздел 2 ВКР Черновик.docx
@@ -3318,7 +3318,43 @@
           <w:sz w:val="28"/>
           <w:szCs w:val="28"/>
         </w:rPr>
-        <w:t xml:space="preserve">Проектирование системы является важным этапом, предшествующим разработке программного продукта любого вида. В ходе проектирования важно </w:t>
+        <w:t xml:space="preserve">Проектирование системы является важным этапом, предшествующим </w:t>
+      </w:r>
+      <w:r>
+        <w:rPr>
+          <w:rFonts w:ascii="Times New Roman" w:hAnsi="Times New Roman" w:cs="Times New Roman"/>
+          <w:bCs/>
+          <w:sz w:val="28"/>
+          <w:szCs w:val="28"/>
+        </w:rPr>
+        <w:t xml:space="preserve">этапу </w:t>
+      </w:r>
+      <w:r>
+        <w:rPr>
+          <w:rFonts w:ascii="Times New Roman" w:hAnsi="Times New Roman" w:cs="Times New Roman"/>
+          <w:bCs/>
+          <w:sz w:val="28"/>
+          <w:szCs w:val="28"/>
+        </w:rPr>
+        <w:t>разработк</w:t>
+      </w:r>
+      <w:r>
+        <w:rPr>
+          <w:rFonts w:ascii="Times New Roman" w:hAnsi="Times New Roman" w:cs="Times New Roman"/>
+          <w:bCs/>
+          <w:sz w:val="28"/>
+          <w:szCs w:val="28"/>
+        </w:rPr>
+        <w:t>и</w:t>
+      </w:r>
+      <w:r>
+        <w:rPr>
+          <w:rFonts w:ascii="Times New Roman" w:hAnsi="Times New Roman" w:cs="Times New Roman"/>
+          <w:bCs/>
+          <w:sz w:val="28"/>
+          <w:szCs w:val="28"/>
+        </w:rPr>
+        <w:t xml:space="preserve"> программного продукта любого вида. В ходе проектирования важно </w:t>
       </w:r>
       <w:r>
         <w:rPr>
@@ -3414,7 +3450,34 @@
           <w:szCs w:val="28"/>
         </w:rPr>
         <w:tab/>
-        <w:t>Спроектировать базу данных, отобразив модель данных в виде ER-диаграммы с пояснениями</w:t>
+        <w:t xml:space="preserve">Спроектировать базу данных, </w:t>
+      </w:r>
+      <w:r>
+        <w:rPr>
+          <w:rFonts w:ascii="Times New Roman" w:hAnsi="Times New Roman" w:cs="Times New Roman"/>
+          <w:bCs/>
+          <w:sz w:val="28"/>
+          <w:szCs w:val="28"/>
+        </w:rPr>
+        <w:t>представив</w:t>
+      </w:r>
+      <w:r>
+        <w:rPr>
+          <w:rFonts w:ascii="Times New Roman" w:hAnsi="Times New Roman" w:cs="Times New Roman"/>
+          <w:bCs/>
+          <w:sz w:val="28"/>
+          <w:szCs w:val="28"/>
+        </w:rPr>
+        <w:t xml:space="preserve"> модель данных в виде ER-диаграммы с </w:t>
+      </w:r>
+      <w:r>
+        <w:rPr>
+          <w:rFonts w:ascii="Times New Roman" w:hAnsi="Times New Roman" w:cs="Times New Roman"/>
+          <w:bCs/>
+          <w:sz w:val="28"/>
+          <w:szCs w:val="28"/>
+        </w:rPr>
+        <w:t>комментариями</w:t>
       </w:r>
     </w:p>
     <w:p>
@@ -3472,7 +3535,43 @@
           <w:szCs w:val="28"/>
         </w:rPr>
         <w:tab/>
-        <w:t>Выбрать технологии и подходы к разработке, отобразить структуру разрабатываемой программы с применением диаграммы классов</w:t>
+        <w:t>Выбрать технологии и подходы к разработке</w:t>
+      </w:r>
+      <w:r>
+        <w:rPr>
+          <w:rFonts w:ascii="Times New Roman" w:hAnsi="Times New Roman" w:cs="Times New Roman"/>
+          <w:bCs/>
+          <w:sz w:val="28"/>
+          <w:szCs w:val="28"/>
+        </w:rPr>
+        <w:t xml:space="preserve"> системы</w:t>
+      </w:r>
+      <w:r>
+        <w:rPr>
+          <w:rFonts w:ascii="Times New Roman" w:hAnsi="Times New Roman" w:cs="Times New Roman"/>
+          <w:bCs/>
+          <w:sz w:val="28"/>
+          <w:szCs w:val="28"/>
+        </w:rPr>
+        <w:t xml:space="preserve">, </w:t>
+      </w:r>
+      <w:r>
+        <w:rPr>
+          <w:rFonts w:ascii="Times New Roman" w:hAnsi="Times New Roman" w:cs="Times New Roman"/>
+          <w:bCs/>
+          <w:sz w:val="28"/>
+          <w:szCs w:val="28"/>
+        </w:rPr>
+        <w:t>представить</w:t>
+      </w:r>
+      <w:r>
+        <w:rPr>
+          <w:rFonts w:ascii="Times New Roman" w:hAnsi="Times New Roman" w:cs="Times New Roman"/>
+          <w:bCs/>
+          <w:sz w:val="28"/>
+          <w:szCs w:val="28"/>
+        </w:rPr>
+        <w:t xml:space="preserve"> структуру разрабатываемой программы с применением диаграммы классов</w:t>
       </w:r>
     </w:p>
     <w:p>
@@ -3501,7 +3600,24 @@
           <w:szCs w:val="28"/>
         </w:rPr>
         <w:tab/>
-        <w:t>Отобразить архитектурное решение и требования к программному и аппаратному обеспечению в виде диаграммы развертывания</w:t>
+      </w:r>
+      <w:r>
+        <w:rPr>
+          <w:rFonts w:ascii="Times New Roman" w:hAnsi="Times New Roman" w:cs="Times New Roman"/>
+          <w:bCs/>
+          <w:sz w:val="28"/>
+          <w:szCs w:val="28"/>
+        </w:rPr>
+        <w:t>Представить</w:t>
+      </w:r>
+      <w:r>
+        <w:rPr>
+          <w:rFonts w:ascii="Times New Roman" w:hAnsi="Times New Roman" w:cs="Times New Roman"/>
+          <w:bCs/>
+          <w:sz w:val="28"/>
+          <w:szCs w:val="28"/>
+        </w:rPr>
+        <w:t xml:space="preserve"> архитектурное решение и требования к программному и аппаратному обеспечению в виде диаграммы развертывания</w:t>
       </w:r>
     </w:p>
     <w:p>
@@ -3612,7 +3728,6 @@
       <w:pPr>
         <w:pStyle w:val="ad"/>
       </w:pPr>
-      <w:commentRangeStart w:id="3"/>
       <w:r>
         <w:lastRenderedPageBreak/>
         <w:t xml:space="preserve">Таблица </w:t>
@@ -3627,15 +3742,6 @@
       </w:fldSimple>
       <w:r>
         <w:t>. Классы пользователей в системе</w:t>
-      </w:r>
-      <w:commentRangeEnd w:id="3"/>
-      <w:r>
-        <w:rPr>
-          <w:rStyle w:val="a6"/>
-          <w:sz w:val="24"/>
-          <w:szCs w:val="24"/>
-        </w:rPr>
-        <w:commentReference w:id="3"/>
       </w:r>
     </w:p>
     <w:tbl>
@@ -3895,7 +4001,7 @@
                 <w:sz w:val="28"/>
                 <w:szCs w:val="28"/>
               </w:rPr>
-              <w:t>Пользователь, не прошедший авторизацию. Имеет доступ к рецептам и продуктам (просмотр)</w:t>
+              <w:t>Пользователь, не прошедший авторизацию. Имеет доступ к просмотру списка рецептов, поиску с фильтрами и категориям, открытию рецепта с возможностью замены ингредиентов</w:t>
             </w:r>
             <w:r>
               <w:rPr>
@@ -3904,7 +4010,7 @@
                 <w:sz w:val="28"/>
                 <w:szCs w:val="28"/>
               </w:rPr>
-              <w:t>, расчёту необходимых КБЖУ в калькуляторе (без сохранения результата)</w:t>
+              <w:t xml:space="preserve"> (без сохранения)</w:t>
             </w:r>
             <w:r>
               <w:rPr>
@@ -3913,7 +4019,7 @@
                 <w:sz w:val="28"/>
                 <w:szCs w:val="28"/>
               </w:rPr>
-              <w:t>, а также авторизации/регистрации.</w:t>
+              <w:t xml:space="preserve"> и просмотра КБЖУ (без сохранения). Также доступны регистрация и авторизация (вход как пользователь или администратор).</w:t>
             </w:r>
           </w:p>
         </w:tc>
@@ -4032,25 +4138,7 @@
                 <w:sz w:val="28"/>
                 <w:szCs w:val="28"/>
               </w:rPr>
-              <w:t>Зарегистрированный пользователь, который может полноценно работать с рецептами, продуктами, профилем, рассчитывать норму калорий и получать отчеты</w:t>
-            </w:r>
-            <w:r>
-              <w:rPr>
-                <w:rFonts w:ascii="Times New Roman" w:eastAsia="Times New Roman" w:hAnsi="Times New Roman" w:cs="Times New Roman"/>
-                <w:color w:val="000000"/>
-                <w:sz w:val="28"/>
-                <w:szCs w:val="28"/>
-              </w:rPr>
-              <w:t xml:space="preserve"> и рекомендации</w:t>
-            </w:r>
-            <w:r>
-              <w:rPr>
-                <w:rFonts w:ascii="Times New Roman" w:eastAsia="Times New Roman" w:hAnsi="Times New Roman" w:cs="Times New Roman"/>
-                <w:color w:val="000000"/>
-                <w:sz w:val="28"/>
-                <w:szCs w:val="28"/>
-              </w:rPr>
-              <w:t>.</w:t>
+              <w:t>Зарегистрированный пользователь, который может полноценно работать с системой: управлять профилем (изменять параметры, пароль, аватар), вести дневник питания (добавлять съеденные блюда, воду, составлять меню на день/неделю), управлять рецептами (добавлять, изменять свои, сохранять в избранное, оценивать, комментировать), работать с продуктовыми запасами (добавлять/удалять продукты, формировать список покупок), отслеживать финансы (чеки, бюджет, графики трат), получать отчёты и рекомендации по питанию, а также отправлять новые продукты и рецепты на модерацию.</w:t>
             </w:r>
           </w:p>
         </w:tc>
@@ -4093,6 +4181,7 @@
                 <w:sz w:val="28"/>
                 <w:szCs w:val="28"/>
               </w:rPr>
+              <w:lastRenderedPageBreak/>
               <w:t>Администратор</w:t>
             </w:r>
           </w:p>
@@ -4169,7 +4258,7 @@
                 <w:sz w:val="28"/>
                 <w:szCs w:val="28"/>
               </w:rPr>
-              <w:t>Существующий пользователь, который занимается модерацией рецептов, продуктов, пользователей</w:t>
+              <w:t>Существующий п</w:t>
             </w:r>
             <w:r>
               <w:rPr>
@@ -4178,7 +4267,7 @@
                 <w:sz w:val="28"/>
                 <w:szCs w:val="28"/>
               </w:rPr>
-              <w:t>, сохранённых меню</w:t>
+              <w:t>ользователь</w:t>
             </w:r>
             <w:r>
               <w:rPr>
@@ -4187,7 +4276,16 @@
                 <w:sz w:val="28"/>
                 <w:szCs w:val="28"/>
               </w:rPr>
-              <w:t>.</w:t>
+              <w:t xml:space="preserve"> с правами администратора</w:t>
+            </w:r>
+            <w:r>
+              <w:rPr>
+                <w:rFonts w:ascii="Times New Roman" w:eastAsia="Times New Roman" w:hAnsi="Times New Roman" w:cs="Times New Roman"/>
+                <w:color w:val="000000"/>
+                <w:sz w:val="28"/>
+                <w:szCs w:val="28"/>
+              </w:rPr>
+              <w:t>, обладающий всеми правами обычного пользователя, а также дополнительными административными функциями: модерация рецептов (проверка, добавление, отклонение, CRUD), модерация продуктов (добавление, удаление, связывание с аналогами), модерация чеков (очистка за период, удаление по ID), управление аккаунтами (создание и удаление аккаунтов пользователей), удаление старых меню пользователей.</w:t>
             </w:r>
           </w:p>
         </w:tc>
@@ -4219,7 +4317,39 @@
           <w:sz w:val="28"/>
           <w:szCs w:val="28"/>
         </w:rPr>
-        <w:t xml:space="preserve">С помощью диаграммы вариантов использования для каждого выделенного класса пользователей можно изобразить пользовательские требования к системе в графическом виде. </w:t>
+        <w:t xml:space="preserve">С помощью диаграммы вариантов использования для каждого выделенного класса пользователей можно </w:t>
+      </w:r>
+      <w:r>
+        <w:rPr>
+          <w:rFonts w:ascii="Times New Roman" w:hAnsi="Times New Roman" w:cs="Times New Roman"/>
+          <w:sz w:val="28"/>
+          <w:szCs w:val="28"/>
+        </w:rPr>
+        <w:t>представить</w:t>
+      </w:r>
+      <w:r>
+        <w:rPr>
+          <w:rFonts w:ascii="Times New Roman" w:hAnsi="Times New Roman" w:cs="Times New Roman"/>
+          <w:sz w:val="28"/>
+          <w:szCs w:val="28"/>
+        </w:rPr>
+        <w:t xml:space="preserve"> пользовательские требования к системе </w:t>
+      </w:r>
+      <w:r>
+        <w:rPr>
+          <w:rFonts w:ascii="Times New Roman" w:hAnsi="Times New Roman" w:cs="Times New Roman"/>
+          <w:sz w:val="28"/>
+          <w:szCs w:val="28"/>
+        </w:rPr>
+        <w:t>графически в виде диаграммы вариантов использования</w:t>
+      </w:r>
+      <w:r>
+        <w:rPr>
+          <w:rFonts w:ascii="Times New Roman" w:hAnsi="Times New Roman" w:cs="Times New Roman"/>
+          <w:sz w:val="28"/>
+          <w:szCs w:val="28"/>
+        </w:rPr>
+        <w:t xml:space="preserve">. </w:t>
       </w:r>
     </w:p>
     <w:p>
@@ -4234,15 +4364,48 @@
           <w:sz w:val="28"/>
           <w:szCs w:val="28"/>
         </w:rPr>
-        <w:t>На диаграмме вариантов использования</w:t>
-      </w:r>
-      <w:r>
-        <w:rPr>
-          <w:rFonts w:ascii="Times New Roman" w:hAnsi="Times New Roman" w:cs="Times New Roman"/>
-          <w:sz w:val="28"/>
-          <w:szCs w:val="28"/>
-        </w:rPr>
-        <w:t>, разбитых по модулям</w:t>
+        <w:lastRenderedPageBreak/>
+        <w:t>На диаграмме</w:t>
+      </w:r>
+      <w:r>
+        <w:rPr>
+          <w:rFonts w:ascii="Times New Roman" w:hAnsi="Times New Roman" w:cs="Times New Roman"/>
+          <w:sz w:val="28"/>
+          <w:szCs w:val="28"/>
+        </w:rPr>
+        <w:t>, разбит</w:t>
+      </w:r>
+      <w:r>
+        <w:rPr>
+          <w:rFonts w:ascii="Times New Roman" w:hAnsi="Times New Roman" w:cs="Times New Roman"/>
+          <w:sz w:val="28"/>
+          <w:szCs w:val="28"/>
+        </w:rPr>
+        <w:t>ой</w:t>
+      </w:r>
+      <w:r>
+        <w:rPr>
+          <w:rFonts w:ascii="Times New Roman" w:hAnsi="Times New Roman" w:cs="Times New Roman"/>
+          <w:sz w:val="28"/>
+          <w:szCs w:val="28"/>
+        </w:rPr>
+        <w:t xml:space="preserve"> по</w:t>
+      </w:r>
+      <w:r>
+        <w:rPr>
+          <w:rFonts w:ascii="Times New Roman" w:hAnsi="Times New Roman" w:cs="Times New Roman"/>
+          <w:sz w:val="28"/>
+          <w:szCs w:val="28"/>
+        </w:rPr>
+        <w:t xml:space="preserve"> условным</w:t>
+      </w:r>
+      <w:r>
+        <w:rPr>
+          <w:rFonts w:ascii="Times New Roman" w:hAnsi="Times New Roman" w:cs="Times New Roman"/>
+          <w:sz w:val="28"/>
+          <w:szCs w:val="28"/>
+        </w:rPr>
+        <w:t xml:space="preserve"> модулям</w:t>
       </w:r>
       <w:r>
         <w:rPr>
@@ -4306,7 +4469,6 @@
           <w:sz w:val="28"/>
           <w:szCs w:val="28"/>
         </w:rPr>
-        <w:lastRenderedPageBreak/>
         <w:t>администраторам</w:t>
       </w:r>
       <w:r>
@@ -4334,7 +4496,7 @@
                     </pic:cNvPicPr>
                   </pic:nvPicPr>
                   <pic:blipFill>
-                    <a:blip r:embed="rId10">
+                    <a:blip r:embed="rId6">
                       <a:extLst>
                         <a:ext uri="{28A0092B-C50C-407E-A947-70E740481C1C}">
                           <a14:useLocalDpi xmlns:a14="http://schemas.microsoft.com/office/drawing/2010/main" val="0"/>
@@ -4416,7 +4578,7 @@
                     </pic:cNvPicPr>
                   </pic:nvPicPr>
                   <pic:blipFill>
-                    <a:blip r:embed="rId11">
+                    <a:blip r:embed="rId7">
                       <a:extLst>
                         <a:ext uri="{28A0092B-C50C-407E-A947-70E740481C1C}">
                           <a14:useLocalDpi xmlns:a14="http://schemas.microsoft.com/office/drawing/2010/main" val="0"/>
@@ -4499,7 +4661,7 @@
                     </pic:cNvPicPr>
                   </pic:nvPicPr>
                   <pic:blipFill>
-                    <a:blip r:embed="rId12">
+                    <a:blip r:embed="rId8">
                       <a:extLst>
                         <a:ext uri="{28A0092B-C50C-407E-A947-70E740481C1C}">
                           <a14:useLocalDpi xmlns:a14="http://schemas.microsoft.com/office/drawing/2010/main" val="0"/>
@@ -4581,7 +4743,7 @@
                     </pic:cNvPicPr>
                   </pic:nvPicPr>
                   <pic:blipFill>
-                    <a:blip r:embed="rId13">
+                    <a:blip r:embed="rId9">
                       <a:extLst>
                         <a:ext uri="{28A0092B-C50C-407E-A947-70E740481C1C}">
                           <a14:useLocalDpi xmlns:a14="http://schemas.microsoft.com/office/drawing/2010/main" val="0"/>
@@ -4648,7 +4810,55 @@
           <w:sz w:val="28"/>
           <w:szCs w:val="28"/>
         </w:rPr>
-        <w:t>Диаграммы для системы планирования питания показывает трёх акторов – Гость, Пользователь и Администратор – и их основные сценарии работы с приложением.</w:t>
+        <w:t>Диаграммы</w:t>
+      </w:r>
+      <w:r>
+        <w:rPr>
+          <w:rFonts w:ascii="Times New Roman" w:hAnsi="Times New Roman" w:cs="Times New Roman"/>
+          <w:sz w:val="28"/>
+          <w:szCs w:val="28"/>
+        </w:rPr>
+        <w:t xml:space="preserve"> вариантов использования</w:t>
+      </w:r>
+      <w:r>
+        <w:rPr>
+          <w:rFonts w:ascii="Times New Roman" w:hAnsi="Times New Roman" w:cs="Times New Roman"/>
+          <w:sz w:val="28"/>
+          <w:szCs w:val="28"/>
+        </w:rPr>
+        <w:t xml:space="preserve"> для системы планирования питания </w:t>
+      </w:r>
+      <w:r>
+        <w:rPr>
+          <w:rFonts w:ascii="Times New Roman" w:hAnsi="Times New Roman" w:cs="Times New Roman"/>
+          <w:sz w:val="28"/>
+          <w:szCs w:val="28"/>
+        </w:rPr>
+        <w:t>демонстрирует</w:t>
+      </w:r>
+      <w:r>
+        <w:rPr>
+          <w:rFonts w:ascii="Times New Roman" w:hAnsi="Times New Roman" w:cs="Times New Roman"/>
+          <w:sz w:val="28"/>
+          <w:szCs w:val="28"/>
+        </w:rPr>
+        <w:t xml:space="preserve"> трёх акторов – Гость, Пользователь</w:t>
+      </w:r>
+      <w:r>
+        <w:rPr>
+          <w:rFonts w:ascii="Times New Roman" w:hAnsi="Times New Roman" w:cs="Times New Roman"/>
+          <w:sz w:val="28"/>
+          <w:szCs w:val="28"/>
+        </w:rPr>
+        <w:t>,</w:t>
+      </w:r>
+      <w:r>
+        <w:rPr>
+          <w:rFonts w:ascii="Times New Roman" w:hAnsi="Times New Roman" w:cs="Times New Roman"/>
+          <w:sz w:val="28"/>
+          <w:szCs w:val="28"/>
+        </w:rPr>
+        <w:t xml:space="preserve"> Администратор – и их основные сценарии работы с приложением.</w:t>
       </w:r>
     </w:p>
     <w:p>
@@ -4661,7 +4871,7 @@
           <w:szCs w:val="28"/>
         </w:rPr>
       </w:pPr>
-      <w:commentRangeStart w:id="4"/>
+      <w:commentRangeStart w:id="3"/>
       <w:r>
         <w:rPr>
           <w:rFonts w:ascii="Times New Roman" w:hAnsi="Times New Roman" w:cs="Times New Roman"/>
@@ -4688,7 +4898,7 @@
         </w:rPr>
         <w:t xml:space="preserve">предусмотрены </w:t>
       </w:r>
-      <w:commentRangeEnd w:id="4"/>
+      <w:commentRangeEnd w:id="3"/>
       <w:r>
         <w:rPr>
           <w:rStyle w:val="a6"/>
@@ -4696,7 +4906,7 @@
           <w:sz w:val="28"/>
           <w:szCs w:val="28"/>
         </w:rPr>
-        <w:commentReference w:id="4"/>
+        <w:commentReference w:id="3"/>
       </w:r>
       <w:r>
         <w:rPr>
@@ -5185,14 +5395,14 @@
           <w:rFonts w:cs="Times New Roman"/>
         </w:rPr>
       </w:pPr>
-      <w:bookmarkStart w:id="5" w:name="_Toc226454926"/>
+      <w:bookmarkStart w:id="4" w:name="_Toc226454926"/>
       <w:r>
         <w:rPr>
           <w:rFonts w:cs="Times New Roman"/>
         </w:rPr>
         <w:t>2.2. Информационное обеспечение</w:t>
       </w:r>
-      <w:bookmarkEnd w:id="5"/>
+      <w:bookmarkEnd w:id="4"/>
     </w:p>
     <w:p>
       <w:pPr>
@@ -5333,7 +5543,7 @@
           <w:szCs w:val="28"/>
         </w:rPr>
       </w:pPr>
-      <w:commentRangeStart w:id="6"/>
+      <w:commentRangeStart w:id="5"/>
       <w:r>
         <w:rPr>
           <w:rFonts w:ascii="Times New Roman" w:hAnsi="Times New Roman" w:cs="Times New Roman"/>
@@ -5352,7 +5562,7 @@
         </w:rPr>
         <w:t> –</w:t>
       </w:r>
-      <w:commentRangeEnd w:id="6"/>
+      <w:commentRangeEnd w:id="5"/>
       <w:r>
         <w:rPr>
           <w:rStyle w:val="a6"/>
@@ -5360,7 +5570,7 @@
           <w:sz w:val="28"/>
           <w:szCs w:val="28"/>
         </w:rPr>
-        <w:commentReference w:id="6"/>
+        <w:commentReference w:id="5"/>
       </w:r>
       <w:r>
         <w:rPr>
@@ -7639,14 +7849,14 @@
           <w:rFonts w:cs="Times New Roman"/>
         </w:rPr>
       </w:pPr>
-      <w:bookmarkStart w:id="7" w:name="_Toc226454927"/>
+      <w:bookmarkStart w:id="6" w:name="_Toc226454927"/>
       <w:r>
         <w:rPr>
           <w:rFonts w:cs="Times New Roman"/>
         </w:rPr>
         <w:t>2.3. Алгоритмическое обеспечение</w:t>
       </w:r>
-      <w:bookmarkEnd w:id="7"/>
+      <w:bookmarkEnd w:id="6"/>
       <w:r>
         <w:rPr>
           <w:rFonts w:cs="Times New Roman"/>
@@ -7762,14 +7972,14 @@
           <w:rFonts w:cs="Times New Roman"/>
         </w:rPr>
       </w:pPr>
-      <w:bookmarkStart w:id="8" w:name="_Toc226454928"/>
+      <w:bookmarkStart w:id="7" w:name="_Toc226454928"/>
       <w:r>
         <w:rPr>
           <w:rFonts w:cs="Times New Roman"/>
         </w:rPr>
         <w:t>2.4. Программное обеспечение</w:t>
       </w:r>
-      <w:bookmarkEnd w:id="8"/>
+      <w:bookmarkEnd w:id="7"/>
     </w:p>
     <w:p>
       <w:pPr>
@@ -7887,14 +8097,14 @@
           <w:rFonts w:cs="Times New Roman"/>
         </w:rPr>
       </w:pPr>
-      <w:bookmarkStart w:id="9" w:name="_Toc226454929"/>
+      <w:bookmarkStart w:id="8" w:name="_Toc226454929"/>
       <w:r>
         <w:rPr>
           <w:rFonts w:cs="Times New Roman"/>
         </w:rPr>
         <w:t>2.5. Обеспечение информационной безопасности</w:t>
       </w:r>
-      <w:bookmarkEnd w:id="9"/>
+      <w:bookmarkEnd w:id="8"/>
     </w:p>
     <w:p>
       <w:pPr>
@@ -7956,15 +8166,15 @@
           <w:rFonts w:cs="Times New Roman"/>
         </w:rPr>
       </w:pPr>
-      <w:bookmarkStart w:id="10" w:name="_Toc226454930"/>
-      <w:commentRangeStart w:id="11"/>
+      <w:bookmarkStart w:id="9" w:name="_Toc226454930"/>
+      <w:commentRangeStart w:id="10"/>
       <w:r>
         <w:rPr>
           <w:rFonts w:cs="Times New Roman"/>
         </w:rPr>
         <w:t>2.6. Техническое обеспечение</w:t>
       </w:r>
-      <w:bookmarkEnd w:id="10"/>
+      <w:bookmarkEnd w:id="9"/>
     </w:p>
     <w:p>
       <w:pPr>
@@ -8025,14 +8235,14 @@
           <w:rFonts w:cs="Times New Roman"/>
         </w:rPr>
       </w:pPr>
-      <w:bookmarkStart w:id="12" w:name="_Toc226454931"/>
+      <w:bookmarkStart w:id="11" w:name="_Toc226454931"/>
       <w:r>
         <w:rPr>
           <w:rFonts w:cs="Times New Roman"/>
         </w:rPr>
         <w:t>2.7. Технологическое обеспечение</w:t>
       </w:r>
-      <w:bookmarkEnd w:id="12"/>
+      <w:bookmarkEnd w:id="11"/>
       <w:r>
         <w:rPr>
           <w:rFonts w:cs="Times New Roman"/>
@@ -8125,14 +8335,14 @@
           <w:rFonts w:cs="Times New Roman"/>
         </w:rPr>
       </w:pPr>
-      <w:bookmarkStart w:id="13" w:name="_Toc226454932"/>
+      <w:bookmarkStart w:id="12" w:name="_Toc226454932"/>
       <w:r>
         <w:rPr>
           <w:rFonts w:cs="Times New Roman"/>
         </w:rPr>
         <w:t>2.8. Организационное обеспечение</w:t>
       </w:r>
-      <w:bookmarkEnd w:id="13"/>
+      <w:bookmarkEnd w:id="12"/>
       <w:r>
         <w:rPr>
           <w:rFonts w:cs="Times New Roman"/>
@@ -8209,7 +8419,7 @@
         </w:rPr>
         <w:t>- изменения в составе функций персонала, организационных единиц (ролевые модели и схемы).</w:t>
       </w:r>
-      <w:commentRangeEnd w:id="11"/>
+      <w:commentRangeEnd w:id="10"/>
       <w:r>
         <w:rPr>
           <w:rStyle w:val="a6"/>
@@ -8217,7 +8427,7 @@
           <w:sz w:val="28"/>
           <w:szCs w:val="28"/>
         </w:rPr>
-        <w:commentReference w:id="11"/>
+        <w:commentReference w:id="10"/>
       </w:r>
     </w:p>
     <w:p>
@@ -8239,71 +8449,71 @@
           <w:rFonts w:cs="Times New Roman"/>
         </w:rPr>
       </w:pPr>
-      <w:bookmarkStart w:id="14" w:name="_Toc226454933"/>
+      <w:bookmarkStart w:id="13" w:name="_Toc226454933"/>
       <w:r>
         <w:rPr>
           <w:rFonts w:cs="Times New Roman"/>
         </w:rPr>
         <w:t>Заключение</w:t>
       </w:r>
+      <w:bookmarkEnd w:id="13"/>
+      <w:r>
+        <w:rPr>
+          <w:rFonts w:cs="Times New Roman"/>
+        </w:rPr>
+        <w:t xml:space="preserve"> </w:t>
+      </w:r>
+    </w:p>
+    <w:p>
+      <w:pPr>
+        <w:pStyle w:val="1"/>
+        <w:rPr>
+          <w:rFonts w:cs="Times New Roman"/>
+        </w:rPr>
+      </w:pPr>
+      <w:bookmarkStart w:id="14" w:name="_Toc226454934"/>
+      <w:r>
+        <w:rPr>
+          <w:rFonts w:cs="Times New Roman"/>
+        </w:rPr>
+        <w:t>Список литературы</w:t>
+      </w:r>
       <w:bookmarkEnd w:id="14"/>
-      <w:r>
+    </w:p>
+    <w:p>
+      <w:pPr>
+        <w:rPr>
+          <w:rFonts w:ascii="Times New Roman" w:hAnsi="Times New Roman" w:cs="Times New Roman"/>
+          <w:i/>
+          <w:sz w:val="28"/>
+          <w:szCs w:val="28"/>
+        </w:rPr>
+      </w:pPr>
+      <w:r>
+        <w:rPr>
+          <w:rFonts w:ascii="Times New Roman" w:hAnsi="Times New Roman" w:cs="Times New Roman"/>
+          <w:i/>
+          <w:sz w:val="28"/>
+          <w:szCs w:val="28"/>
+        </w:rPr>
+        <w:t>Не менее 20 источников</w:t>
+      </w:r>
+    </w:p>
+    <w:p>
+      <w:pPr>
+        <w:pStyle w:val="1"/>
         <w:rPr>
           <w:rFonts w:cs="Times New Roman"/>
         </w:rPr>
-        <w:t xml:space="preserve"> </w:t>
-      </w:r>
-    </w:p>
-    <w:p>
-      <w:pPr>
-        <w:pStyle w:val="1"/>
+      </w:pPr>
+      <w:bookmarkStart w:id="15" w:name="_Toc226454935"/>
+      <w:r>
         <w:rPr>
           <w:rFonts w:cs="Times New Roman"/>
         </w:rPr>
-      </w:pPr>
-      <w:bookmarkStart w:id="15" w:name="_Toc226454934"/>
-      <w:r>
-        <w:rPr>
-          <w:rFonts w:cs="Times New Roman"/>
-        </w:rPr>
-        <w:t>Список литературы</w:t>
+        <w:t>Приложение</w:t>
       </w:r>
       <w:bookmarkEnd w:id="15"/>
-    </w:p>
-    <w:p>
-      <w:pPr>
-        <w:rPr>
-          <w:rFonts w:ascii="Times New Roman" w:hAnsi="Times New Roman" w:cs="Times New Roman"/>
-          <w:i/>
-          <w:sz w:val="28"/>
-          <w:szCs w:val="28"/>
-        </w:rPr>
-      </w:pPr>
-      <w:r>
-        <w:rPr>
-          <w:rFonts w:ascii="Times New Roman" w:hAnsi="Times New Roman" w:cs="Times New Roman"/>
-          <w:i/>
-          <w:sz w:val="28"/>
-          <w:szCs w:val="28"/>
-        </w:rPr>
-        <w:t>Не менее 20 источников</w:t>
-      </w:r>
-    </w:p>
-    <w:p>
-      <w:pPr>
-        <w:pStyle w:val="1"/>
-        <w:rPr>
-          <w:rFonts w:cs="Times New Roman"/>
-        </w:rPr>
-      </w:pPr>
-      <w:bookmarkStart w:id="16" w:name="_Toc226454935"/>
-      <w:r>
-        <w:rPr>
-          <w:rFonts w:cs="Times New Roman"/>
-        </w:rPr>
-        <w:t>Приложение</w:t>
-      </w:r>
-      <w:bookmarkEnd w:id="16"/>
     </w:p>
     <w:p>
       <w:pPr>
@@ -8365,7 +8575,7 @@
 
 <file path=word/comments.xml><?xml version="1.0" encoding="utf-8"?>
 <w:comments xmlns:wpc="http://schemas.microsoft.com/office/word/2010/wordprocessingCanvas" xmlns:cx="http://schemas.microsoft.com/office/drawing/2014/chartex" xmlns:cx1="http://schemas.microsoft.com/office/drawing/2015/9/8/chartex" xmlns:cx2="http://schemas.microsoft.com/office/drawing/2015/10/21/chartex" xmlns:cx3="http://schemas.microsoft.com/office/drawing/2016/5/9/chartex" xmlns:cx4="http://schemas.microsoft.com/office/drawing/2016/5/10/chartex" xmlns:cx5="http://schemas.microsoft.com/office/drawing/2016/5/11/chartex" xmlns:cx6="http://schemas.microsoft.com/office/drawing/2016/5/12/chartex" xmlns:cx7="http://schemas.microsoft.com/office/drawing/2016/5/13/chartex" xmlns:cx8="http://schemas.microsoft.com/office/drawing/2016/5/14/chartex" xmlns:mc="http://schemas.openxmlformats.org/markup-compatibility/2006" xmlns:aink="http://schemas.microsoft.com/office/drawing/2016/ink" xmlns:am3d="http://schemas.microsoft.com/office/drawing/2017/model3d" xmlns:o="urn:schemas-microsoft-com:office:office" xmlns:oel="http://schemas.microsoft.com/office/2019/extlst" xmlns:r="http://schemas.openxmlformats.org/officeDocument/2006/relationships" xmlns:m="http://schemas.openxmlformats.org/officeDocument/2006/math" xmlns:v="urn:schemas-microsoft-com:vml" xmlns:wp14="http://schemas.microsoft.com/office/word/2010/wordprocessingDrawing" xmlns:wp="http://schemas.openxmlformats.org/drawingml/2006/wordprocessingDrawing" xmlns:w10="urn:schemas-microsoft-com:office:word" xmlns:w="http://schemas.openxmlformats.org/wordprocessingml/2006/main" xmlns:w14="http://schemas.microsoft.com/office/word/2010/wordml" xmlns:w15="http://schemas.microsoft.com/office/word/2012/wordml" xmlns:w16cex="http://schemas.microsoft.com/office/word/2018/wordml/cex" xmlns:w16cid="http://schemas.microsoft.com/office/word/2016/wordml/cid" xmlns:w16="http://schemas.microsoft.com/office/word/2018/wordml" xmlns:w16du="http://schemas.microsoft.com/office/word/2023/wordml/word16du" xmlns:w16sdtdh="http://schemas.microsoft.com/office/word/2020/wordml/sdtdatahash" xmlns:w16sdtfl="http://schemas.microsoft.com/office/word/2024/wordml/sdtformatlock" xmlns:w16se="http://schemas.microsoft.com/office/word/2015/wordml/symex" xmlns:wpg="http://schemas.microsoft.com/office/word/2010/wordprocessingGroup" xmlns:wpi="http://schemas.microsoft.com/office/word/2010/wordprocessingInk" xmlns:wne="http://schemas.microsoft.com/office/word/2006/wordml" xmlns:wps="http://schemas.microsoft.com/office/word/2010/wordprocessingShape" mc:Ignorable="w14 w15 w16se w16cid w16 w16cex w16sdtdh w16sdtfl w16du wp14">
-  <w:comment w:id="3" w:author="Бакшаева Елена" w:date="2026-04-07T11:59:00Z" w:initials="БЕ">
+  <w:comment w:id="3" w:author="Бакшаева Елена" w:date="2026-04-07T13:56:00Z" w:initials="БЕ">
     <w:p>
       <w:pPr>
         <w:pStyle w:val="a7"/>
@@ -8377,48 +8587,27 @@
         <w:annotationRef/>
       </w:r>
       <w:r>
-        <w:t>Расписать подробнее</w:t>
-      </w:r>
-    </w:p>
+        <w:t>Отредактировать отседа до конца</w:t>
+      </w:r>
+    </w:p>
+  </w:comment>
+  <w:comment w:id="5" w:author="Бакшаева Елена" w:date="2026-04-07T14:08:00Z" w:initials="БЕ">
     <w:p>
       <w:pPr>
         <w:pStyle w:val="a7"/>
       </w:pPr>
+      <w:r>
+        <w:rPr>
+          <w:rStyle w:val="a6"/>
+        </w:rPr>
+        <w:annotationRef/>
+      </w:r>
+      <w:r>
+        <w:t>Отредактировать отседа до конца</w:t>
+      </w:r>
     </w:p>
   </w:comment>
-  <w:comment w:id="4" w:author="Бакшаева Елена" w:date="2026-04-07T13:56:00Z" w:initials="БЕ">
-    <w:p>
-      <w:pPr>
-        <w:pStyle w:val="a7"/>
-      </w:pPr>
-      <w:r>
-        <w:rPr>
-          <w:rStyle w:val="a6"/>
-        </w:rPr>
-        <w:annotationRef/>
-      </w:r>
-      <w:r>
-        <w:t>Отредактировать отседа до конца</w:t>
-      </w:r>
-    </w:p>
-  </w:comment>
-  <w:comment w:id="6" w:author="Бакшаева Елена" w:date="2026-04-07T14:08:00Z" w:initials="БЕ">
-    <w:p>
-      <w:pPr>
-        <w:pStyle w:val="a7"/>
-      </w:pPr>
-      <w:r>
-        <w:rPr>
-          <w:rStyle w:val="a6"/>
-        </w:rPr>
-        <w:annotationRef/>
-      </w:r>
-      <w:r>
-        <w:t>Отредактировать отседа до конца</w:t>
-      </w:r>
-    </w:p>
-  </w:comment>
-  <w:comment w:id="11" w:author="Бакшаева Елена" w:date="2026-04-07T11:44:00Z" w:initials="БЕ">
+  <w:comment w:id="10" w:author="Бакшаева Елена" w:date="2026-04-07T11:44:00Z" w:initials="БЕ">
     <w:p>
       <w:pPr>
         <w:pStyle w:val="a7"/>
@@ -8439,7 +8628,6 @@
 
 <file path=word/commentsExtended.xml><?xml version="1.0" encoding="utf-8"?>
 <w15:commentsEx xmlns:wpc="http://schemas.microsoft.com/office/word/2010/wordprocessingCanvas" xmlns:cx="http://schemas.microsoft.com/office/drawing/2014/chartex" xmlns:cx1="http://schemas.microsoft.com/office/drawing/2015/9/8/chartex" xmlns:cx2="http://schemas.microsoft.com/office/drawing/2015/10/21/chartex" xmlns:cx3="http://schemas.microsoft.com/office/drawing/2016/5/9/chartex" xmlns:cx4="http://schemas.microsoft.com/office/drawing/2016/5/10/chartex" xmlns:cx5="http://schemas.microsoft.com/office/drawing/2016/5/11/chartex" xmlns:cx6="http://schemas.microsoft.com/office/drawing/2016/5/12/chartex" xmlns:cx7="http://schemas.microsoft.com/office/drawing/2016/5/13/chartex" xmlns:cx8="http://schemas.microsoft.com/office/drawing/2016/5/14/chartex" xmlns:mc="http://schemas.openxmlformats.org/markup-compatibility/2006" xmlns:aink="http://schemas.microsoft.com/office/drawing/2016/ink" xmlns:am3d="http://schemas.microsoft.com/office/drawing/2017/model3d" xmlns:o="urn:schemas-microsoft-com:office:office" xmlns:oel="http://schemas.microsoft.com/office/2019/extlst" xmlns:r="http://schemas.openxmlformats.org/officeDocument/2006/relationships" xmlns:m="http://schemas.openxmlformats.org/officeDocument/2006/math" xmlns:v="urn:schemas-microsoft-com:vml" xmlns:wp14="http://schemas.microsoft.com/office/word/2010/wordprocessingDrawing" xmlns:wp="http://schemas.openxmlformats.org/drawingml/2006/wordprocessingDrawing" xmlns:w10="urn:schemas-microsoft-com:office:word" xmlns:w="http://schemas.openxmlformats.org/wordprocessingml/2006/main" xmlns:w14="http://schemas.microsoft.com/office/word/2010/wordml" xmlns:w15="http://schemas.microsoft.com/office/word/2012/wordml" xmlns:w16cex="http://schemas.microsoft.com/office/word/2018/wordml/cex" xmlns:w16cid="http://schemas.microsoft.com/office/word/2016/wordml/cid" xmlns:w16="http://schemas.microsoft.com/office/word/2018/wordml" xmlns:w16du="http://schemas.microsoft.com/office/word/2023/wordml/word16du" xmlns:w16sdtdh="http://schemas.microsoft.com/office/word/2020/wordml/sdtdatahash" xmlns:w16sdtfl="http://schemas.microsoft.com/office/word/2024/wordml/sdtformatlock" xmlns:w16se="http://schemas.microsoft.com/office/word/2015/wordml/symex" xmlns:wpg="http://schemas.microsoft.com/office/word/2010/wordprocessingGroup" xmlns:wpi="http://schemas.microsoft.com/office/word/2010/wordprocessingInk" xmlns:wne="http://schemas.microsoft.com/office/word/2006/wordml" xmlns:wps="http://schemas.microsoft.com/office/word/2010/wordprocessingShape" mc:Ignorable="w14 w15 w16se w16cid w16 w16cex w16sdtdh w16sdtfl w16du wp14">
-  <w15:commentEx w15:paraId="147580A5" w15:done="0"/>
   <w15:commentEx w15:paraId="328329F8" w15:done="0"/>
   <w15:commentEx w15:paraId="340CFE22" w15:done="0"/>
   <w15:commentEx w15:paraId="4F8CBD97" w15:done="0"/>
@@ -8448,7 +8636,6 @@
 
 <file path=word/commentsExtensible.xml><?xml version="1.0" encoding="utf-8"?>
 <w16cex:commentsExtensible xmlns:wpc="http://schemas.microsoft.com/office/word/2010/wordprocessingCanvas" xmlns:cx="http://schemas.microsoft.com/office/drawing/2014/chartex" xmlns:cx1="http://schemas.microsoft.com/office/drawing/2015/9/8/chartex" xmlns:cx2="http://schemas.microsoft.com/office/drawing/2015/10/21/chartex" xmlns:cx3="http://schemas.microsoft.com/office/drawing/2016/5/9/chartex" xmlns:cx4="http://schemas.microsoft.com/office/drawing/2016/5/10/chartex" xmlns:cx5="http://schemas.microsoft.com/office/drawing/2016/5/11/chartex" xmlns:cx6="http://schemas.microsoft.com/office/drawing/2016/5/12/chartex" xmlns:cx7="http://schemas.microsoft.com/office/drawing/2016/5/13/chartex" xmlns:cx8="http://schemas.microsoft.com/office/drawing/2016/5/14/chartex" xmlns:cr="http://schemas.microsoft.com/office/comments/2020/reactions" xmlns:mc="http://schemas.openxmlformats.org/markup-compatibility/2006" xmlns:aink="http://schemas.microsoft.com/office/drawing/2016/ink" xmlns:am3d="http://schemas.microsoft.com/office/drawing/2017/model3d" xmlns:o="urn:schemas-microsoft-com:office:office" xmlns:oel="http://schemas.microsoft.com/office/2019/extlst" xmlns:r="http://schemas.openxmlformats.org/officeDocument/2006/relationships" xmlns:m="http://schemas.openxmlformats.org/officeDocument/2006/math" xmlns:v="urn:schemas-microsoft-com:vml" xmlns:wp14="http://schemas.microsoft.com/office/word/2010/wordprocessingDrawing" xmlns:wp="http://schemas.openxmlformats.org/drawingml/2006/wordprocessingDrawing" xmlns:w10="urn:schemas-microsoft-com:office:word" xmlns:w="http://schemas.openxmlformats.org/wordprocessingml/2006/main" xmlns:w14="http://schemas.microsoft.com/office/word/2010/wordml" xmlns:w15="http://schemas.microsoft.com/office/word/2012/wordml" xmlns:w16cex="http://schemas.microsoft.com/office/word/2018/wordml/cex" xmlns:w16cid="http://schemas.microsoft.com/office/word/2016/wordml/cid" xmlns:w16="http://schemas.microsoft.com/office/word/2018/wordml" xmlns:w16du="http://schemas.microsoft.com/office/word/2023/wordml/word16du" xmlns:w16sdtdh="http://schemas.microsoft.com/office/word/2020/wordml/sdtdatahash" xmlns:w16sdtfl="http://schemas.microsoft.com/office/word/2024/wordml/sdtformatlock" xmlns:w16se="http://schemas.microsoft.com/office/word/2015/wordml/symex" xmlns:wpg="http://schemas.microsoft.com/office/word/2010/wordprocessingGroup" xmlns:wpi="http://schemas.microsoft.com/office/word/2010/wordprocessingInk" xmlns:wne="http://schemas.microsoft.com/office/word/2006/wordml" xmlns:wps="http://schemas.microsoft.com/office/word/2010/wordprocessingShape" mc:Ignorable="w14 w15 w16se w16cid w16 w16cex w16sdtdh w16sdtfl cr w16du wp14">
-  <w16cex:commentExtensible w16cex:durableId="263BBB01" w16cex:dateUtc="2026-04-07T07:59:00Z"/>
   <w16cex:commentExtensible w16cex:durableId="015ED4E1" w16cex:dateUtc="2026-04-07T09:56:00Z"/>
   <w16cex:commentExtensible w16cex:durableId="0F893B3D" w16cex:dateUtc="2026-04-07T10:08:00Z"/>
   <w16cex:commentExtensible w16cex:durableId="216136C9" w16cex:dateUtc="2026-04-07T07:44:00Z"/>
@@ -8457,7 +8644,6 @@
 
 <file path=word/commentsIds.xml><?xml version="1.0" encoding="utf-8"?>
 <w16cid:commentsIds xmlns:wpc="http://schemas.microsoft.com/office/word/2010/wordprocessingCanvas" xmlns:cx="http://schemas.microsoft.com/office/drawing/2014/chartex" xmlns:cx1="http://schemas.microsoft.com/office/drawing/2015/9/8/chartex" xmlns:cx2="http://schemas.microsoft.com/office/drawing/2015/10/21/chartex" xmlns:cx3="http://schemas.microsoft.com/office/drawing/2016/5/9/chartex" xmlns:cx4="http://schemas.microsoft.com/office/drawing/2016/5/10/chartex" xmlns:cx5="http://schemas.microsoft.com/office/drawing/2016/5/11/chartex" xmlns:cx6="http://schemas.microsoft.com/office/drawing/2016/5/12/chartex" xmlns:cx7="http://schemas.microsoft.com/office/drawing/2016/5/13/chartex" xmlns:cx8="http://schemas.microsoft.com/office/drawing/2016/5/14/chartex" xmlns:mc="http://schemas.openxmlformats.org/markup-compatibility/2006" xmlns:aink="http://schemas.microsoft.com/office/drawing/2016/ink" xmlns:am3d="http://schemas.microsoft.com/office/drawing/2017/model3d" xmlns:o="urn:schemas-microsoft-com:office:office" xmlns:oel="http://schemas.microsoft.com/office/2019/extlst" xmlns:r="http://schemas.openxmlformats.org/officeDocument/2006/relationships" xmlns:m="http://schemas.openxmlformats.org/officeDocument/2006/math" xmlns:v="urn:schemas-microsoft-com:vml" xmlns:wp14="http://schemas.microsoft.com/office/word/2010/wordprocessingDrawing" xmlns:wp="http://schemas.openxmlformats.org/drawingml/2006/wordprocessingDrawing" xmlns:w10="urn:schemas-microsoft-com:office:word" xmlns:w="http://schemas.openxmlformats.org/wordprocessingml/2006/main" xmlns:w14="http://schemas.microsoft.com/office/word/2010/wordml" xmlns:w15="http://schemas.microsoft.com/office/word/2012/wordml" xmlns:w16cex="http://schemas.microsoft.com/office/word/2018/wordml/cex" xmlns:w16cid="http://schemas.microsoft.com/office/word/2016/wordml/cid" xmlns:w16="http://schemas.microsoft.com/office/word/2018/wordml" xmlns:w16du="http://schemas.microsoft.com/office/word/2023/wordml/word16du" xmlns:w16sdtdh="http://schemas.microsoft.com/office/word/2020/wordml/sdtdatahash" xmlns:w16sdtfl="http://schemas.microsoft.com/office/word/2024/wordml/sdtformatlock" xmlns:w16se="http://schemas.microsoft.com/office/word/2015/wordml/symex" xmlns:wpg="http://schemas.microsoft.com/office/word/2010/wordprocessingGroup" xmlns:wpi="http://schemas.microsoft.com/office/word/2010/wordprocessingInk" xmlns:wne="http://schemas.microsoft.com/office/word/2006/wordml" xmlns:wps="http://schemas.microsoft.com/office/word/2010/wordprocessingShape" mc:Ignorable="w14 w15 w16se w16cid w16 w16cex w16sdtdh w16sdtfl w16du wp14">
-  <w16cid:commentId w16cid:paraId="147580A5" w16cid:durableId="263BBB01"/>
   <w16cid:commentId w16cid:paraId="328329F8" w16cid:durableId="015ED4E1"/>
   <w16cid:commentId w16cid:paraId="340CFE22" w16cid:durableId="0F893B3D"/>
   <w16cid:commentId w16cid:paraId="4F8CBD97" w16cid:durableId="216136C9"/>
@@ -9231,7 +9417,6 @@
   <w:style w:type="character" w:default="1" w:styleId="a0">
     <w:name w:val="Default Paragraph Font"/>
     <w:uiPriority w:val="1"/>
-    <w:semiHidden/>
     <w:unhideWhenUsed/>
   </w:style>
   <w:style w:type="table" w:default="1" w:styleId="a1">

</xml_diff>

<commit_message>
vault backup: 2026-04-08 15:12:46
</commit_message>
<xml_diff>
--- a/Раздел 2 ВКР Черновик.docx
+++ b/Раздел 2 ВКР Черновик.docx
@@ -11293,7 +11293,67 @@
           <w:sz w:val="28"/>
           <w:szCs w:val="28"/>
         </w:rPr>
-        <w:t>Связи между слоями приложения представлены на рисунке 17. Компоненты UI вызывают композаблы и диспатчат действия Vuex; Vuex-действия обращаются к API-сервисам; полученные данные через мутации попадают в состояние; компоненты реактивно отображают изменения. Маршрутизация через Vue Router связывает URL с компонентами страниц и проверяет права доступа через guards.</w:t>
+        <w:t xml:space="preserve">Связи между слоями приложения представлены на рисунке 17. Компоненты UI вызывают </w:t>
+      </w:r>
+      <w:r>
+        <w:rPr>
+          <w:rFonts w:ascii="Times New Roman" w:hAnsi="Times New Roman" w:cs="Times New Roman"/>
+          <w:b/>
+          <w:bCs/>
+          <w:sz w:val="28"/>
+          <w:szCs w:val="28"/>
+        </w:rPr>
+        <w:t>composables</w:t>
+      </w:r>
+      <w:r>
+        <w:rPr>
+          <w:rFonts w:ascii="Times New Roman" w:hAnsi="Times New Roman" w:cs="Times New Roman"/>
+          <w:b/>
+          <w:bCs/>
+          <w:sz w:val="28"/>
+          <w:szCs w:val="28"/>
+        </w:rPr>
+        <w:t xml:space="preserve"> </w:t>
+      </w:r>
+      <w:r>
+        <w:rPr>
+          <w:rFonts w:ascii="Times New Roman" w:hAnsi="Times New Roman" w:cs="Times New Roman"/>
+          <w:sz w:val="28"/>
+          <w:szCs w:val="28"/>
+        </w:rPr>
+        <w:t xml:space="preserve">и </w:t>
+      </w:r>
+      <w:r>
+        <w:rPr>
+          <w:rFonts w:ascii="Times New Roman" w:hAnsi="Times New Roman" w:cs="Times New Roman"/>
+          <w:sz w:val="28"/>
+          <w:szCs w:val="28"/>
+        </w:rPr>
+        <w:t>диспатчат (отправляют</w:t>
+      </w:r>
+      <w:r>
+        <w:rPr>
+          <w:rFonts w:ascii="Times New Roman" w:hAnsi="Times New Roman" w:cs="Times New Roman"/>
+          <w:sz w:val="28"/>
+          <w:szCs w:val="28"/>
+        </w:rPr>
+        <w:t xml:space="preserve"> действия</w:t>
+      </w:r>
+      <w:r>
+        <w:rPr>
+          <w:rFonts w:ascii="Times New Roman" w:hAnsi="Times New Roman" w:cs="Times New Roman"/>
+          <w:sz w:val="28"/>
+          <w:szCs w:val="28"/>
+        </w:rPr>
+        <w:t xml:space="preserve"> для обновления состояния)</w:t>
+      </w:r>
+      <w:r>
+        <w:rPr>
+          <w:rFonts w:ascii="Times New Roman" w:hAnsi="Times New Roman" w:cs="Times New Roman"/>
+          <w:sz w:val="28"/>
+          <w:szCs w:val="28"/>
+        </w:rPr>
+        <w:t xml:space="preserve"> Vuex; Vuex-действия обращаются к API-сервисам; полученные данные через мутации попадают в состояние; компоненты реактивно отображают изменения. Маршрутизация через Vue Router связывает URL с компонентами страниц и проверяет права доступа через guards.</w:t>
       </w:r>
     </w:p>
     <w:p>

</xml_diff>